<commit_message>
praca nad ustaleniem plci i glownymi petlami
</commit_message>
<xml_diff>
--- a/dokumentacja.docx
+++ b/dokumentacja.docx
@@ -1,6 +1,6 @@
 
 <file path=word/document.xml><?xml version="1.0" encoding="utf-8"?>
-<w:document xmlns:ve="http://schemas.openxmlformats.org/markup-compatibility/2006" xmlns:o="urn:schemas-microsoft-com:office:office" xmlns:r="http://schemas.openxmlformats.org/officeDocument/2006/relationships" xmlns:m="http://schemas.openxmlformats.org/officeDocument/2006/math" xmlns:v="urn:schemas-microsoft-com:vml" xmlns:wp="http://schemas.openxmlformats.org/drawingml/2006/wordprocessingDrawing" xmlns:w10="urn:schemas-microsoft-com:office:word" xmlns:w="http://schemas.openxmlformats.org/wordprocessingml/2006/main" xmlns:wne="http://schemas.microsoft.com/office/word/2006/wordml">
+<w:document xmlns:wpc="http://schemas.microsoft.com/office/word/2010/wordprocessingCanvas" xmlns:mc="http://schemas.openxmlformats.org/markup-compatibility/2006" xmlns:o="urn:schemas-microsoft-com:office:office" xmlns:r="http://schemas.openxmlformats.org/officeDocument/2006/relationships" xmlns:m="http://schemas.openxmlformats.org/officeDocument/2006/math" xmlns:v="urn:schemas-microsoft-com:vml" xmlns:wp14="http://schemas.microsoft.com/office/word/2010/wordprocessingDrawing" xmlns:wp="http://schemas.openxmlformats.org/drawingml/2006/wordprocessingDrawing" xmlns:w10="urn:schemas-microsoft-com:office:word" xmlns:w="http://schemas.openxmlformats.org/wordprocessingml/2006/main" xmlns:w14="http://schemas.microsoft.com/office/word/2010/wordml" xmlns:wpg="http://schemas.microsoft.com/office/word/2010/wordprocessingGroup" xmlns:wpi="http://schemas.microsoft.com/office/word/2010/wordprocessingInk" xmlns:wne="http://schemas.microsoft.com/office/word/2006/wordml" xmlns:wps="http://schemas.microsoft.com/office/word/2010/wordprocessingShape" mc:Ignorable="w14 wp14">
   <w:body>
     <w:p>
       <w:r>
@@ -30,7 +30,15 @@
         <w:t>-Gra dwóch osób w kółko i krzyżyk. Dwie osoby grają na przemian.  Dane są wypisywane. Będzie w tej grze również punktacja. Kolejność gry będzie ustalana przez graczy.</w:t>
       </w:r>
       <w:r>
-        <w:t xml:space="preserve"> Użytkownicy będą pytani o swoje imona na początku gry. Gra będzie synchronizowana za każdym razem podjęcia ruchu. Wygrywa osoba, która ma ustawione kółka lub krzyżyki w pionie, poziomie lub na skos.</w:t>
+        <w:t xml:space="preserve"> Użytkownicy będą pytani o swoje </w:t>
+      </w:r>
+      <w:proofErr w:type="spellStart"/>
+      <w:r>
+        <w:t>imona</w:t>
+      </w:r>
+      <w:proofErr w:type="spellEnd"/>
+      <w:r>
+        <w:t xml:space="preserve"> na początku gry. Gra będzie synchronizowana za każdym razem podjęcia ruchu. Wygrywa osoba, która ma ustawione kółka lub krzyżyki w pionie, poziomie lub na skos.</w:t>
       </w:r>
     </w:p>
     <w:p>
@@ -99,7 +107,16 @@
         </w:tabs>
       </w:pPr>
       <w:r>
-        <w:t>-zapisuję bliotekę conio.h do wciśnięcia spacji podczas rozpoczynania gry;</w:t>
+        <w:t>-zapisuję bibliotekę &lt;</w:t>
+      </w:r>
+      <w:r>
+        <w:t xml:space="preserve"> conio.h</w:t>
+      </w:r>
+      <w:r>
+        <w:t>&gt;</w:t>
+      </w:r>
+      <w:r>
+        <w:t xml:space="preserve"> do wciśnięcia spacji podczas rozpoczynania gry;</w:t>
       </w:r>
     </w:p>
     <w:p>
@@ -111,6 +128,83 @@
       <w:r>
         <w:t>-Zaczynam pisać kod dla rozgrywek. Tylko od początku gracz 1 zaczyna grę. Potem idzie to już po kolei.</w:t>
       </w:r>
+    </w:p>
+    <w:p>
+      <w:pPr>
+        <w:tabs>
+          <w:tab w:val="left" w:pos="3810"/>
+        </w:tabs>
+      </w:pPr>
+      <w:r>
+        <w:t>5 czerwca:</w:t>
+      </w:r>
+      <w:r>
+        <w:tab/>
+      </w:r>
+      <w:r>
+        <w:tab/>
+      </w:r>
+      <w:r>
+        <w:tab/>
+      </w:r>
+      <w:r>
+        <w:tab/>
+      </w:r>
+      <w:r>
+        <w:tab/>
+      </w:r>
+    </w:p>
+    <w:p>
+      <w:pPr>
+        <w:tabs>
+          <w:tab w:val="left" w:pos="3810"/>
+        </w:tabs>
+      </w:pPr>
+      <w:r>
+        <w:t xml:space="preserve">-Dzisiaj rozwinąłem  </w:t>
+      </w:r>
+      <w:bookmarkStart w:id="0" w:name="_GoBack"/>
+      <w:bookmarkEnd w:id="0"/>
+      <w:r>
+        <w:t>główne pętle odpowiadające za główny przebieg gry.</w:t>
+      </w:r>
+    </w:p>
+    <w:p>
+      <w:pPr>
+        <w:tabs>
+          <w:tab w:val="left" w:pos="3810"/>
+        </w:tabs>
+      </w:pPr>
+      <w:r>
+        <w:t>-Napisałem kod z wykorzystaniem funkcji konwertującej zmienną string na tablicę typu char w celu określenia płci użytkowników. Pomoże to w dobrym zwracaniu się do nich podczas rozgrywek i na końcu gry;</w:t>
+      </w:r>
+    </w:p>
+    <w:p>
+      <w:pPr>
+        <w:tabs>
+          <w:tab w:val="left" w:pos="3810"/>
+        </w:tabs>
+      </w:pPr>
+      <w:r>
+        <w:t>-Wymyśliłem, że na końcu gry dla osoby, która wygrała, będzie zagrana muzyczka końcowa z gry Super Mario Bros. Zrobię to z pomocą biblioteki &lt;windows.h&gt;  i  funkcji Beep().</w:t>
+      </w:r>
+    </w:p>
+    <w:p>
+      <w:pPr>
+        <w:tabs>
+          <w:tab w:val="left" w:pos="3810"/>
+        </w:tabs>
+      </w:pPr>
+      <w:r>
+        <w:t>-Dzisiaj wszystko udało się pomyślnie skompilować i następnym razem będę kontynuował pracę nad algorytmem oceniającym, czy już ktoś wygrał, czy też nie.</w:t>
+      </w:r>
+    </w:p>
+    <w:p>
+      <w:pPr>
+        <w:tabs>
+          <w:tab w:val="left" w:pos="3810"/>
+        </w:tabs>
+      </w:pPr>
     </w:p>
     <w:sectPr>
       <w:pgSz w:w="11906" w:h="16838"/>
@@ -123,7 +217,7 @@
 </file>
 
 <file path=word/styles.xml><?xml version="1.0" encoding="utf-8"?>
-<w:styles xmlns:r="http://schemas.openxmlformats.org/officeDocument/2006/relationships" xmlns:w="http://schemas.openxmlformats.org/wordprocessingml/2006/main">
+<w:styles xmlns:mc="http://schemas.openxmlformats.org/markup-compatibility/2006" xmlns:r="http://schemas.openxmlformats.org/officeDocument/2006/relationships" xmlns:w="http://schemas.openxmlformats.org/wordprocessingml/2006/main" xmlns:w14="http://schemas.microsoft.com/office/word/2010/wordml" mc:Ignorable="w14">
   <w:docDefaults>
     <w:rPrDefault>
       <w:rPr>
@@ -294,7 +388,196 @@
     <w:uiPriority w:val="99"/>
     <w:semiHidden/>
     <w:unhideWhenUsed/>
+    <w:tblPr>
+      <w:tblInd w:w="0" w:type="dxa"/>
+      <w:tblCellMar>
+        <w:top w:w="0" w:type="dxa"/>
+        <w:left w:w="108" w:type="dxa"/>
+        <w:bottom w:w="0" w:type="dxa"/>
+        <w:right w:w="108" w:type="dxa"/>
+      </w:tblCellMar>
+    </w:tblPr>
+  </w:style>
+  <w:style w:type="numbering" w:default="1" w:styleId="Bezlisty">
+    <w:name w:val="No List"/>
+    <w:uiPriority w:val="99"/>
+    <w:semiHidden/>
+    <w:unhideWhenUsed/>
+  </w:style>
+</w:styles>
+</file>
+
+<file path=word/stylesWithEffects.xml><?xml version="1.0" encoding="utf-8"?>
+<w:styles xmlns:wpc="http://schemas.microsoft.com/office/word/2010/wordprocessingCanvas" xmlns:mc="http://schemas.openxmlformats.org/markup-compatibility/2006" xmlns:o="urn:schemas-microsoft-com:office:office" xmlns:r="http://schemas.openxmlformats.org/officeDocument/2006/relationships" xmlns:m="http://schemas.openxmlformats.org/officeDocument/2006/math" xmlns:v="urn:schemas-microsoft-com:vml" xmlns:wp14="http://schemas.microsoft.com/office/word/2010/wordprocessingDrawing" xmlns:wp="http://schemas.openxmlformats.org/drawingml/2006/wordprocessingDrawing" xmlns:w10="urn:schemas-microsoft-com:office:word" xmlns:w="http://schemas.openxmlformats.org/wordprocessingml/2006/main" xmlns:w14="http://schemas.microsoft.com/office/word/2010/wordml" xmlns:wpg="http://schemas.microsoft.com/office/word/2010/wordprocessingGroup" xmlns:wpi="http://schemas.microsoft.com/office/word/2010/wordprocessingInk" xmlns:wne="http://schemas.microsoft.com/office/word/2006/wordml" xmlns:wps="http://schemas.microsoft.com/office/word/2010/wordprocessingShape" mc:Ignorable="w14 wp14">
+  <w:docDefaults>
+    <w:rPrDefault>
+      <w:rPr>
+        <w:rFonts w:asciiTheme="minorHAnsi" w:eastAsiaTheme="minorEastAsia" w:hAnsiTheme="minorHAnsi" w:cstheme="minorBidi"/>
+        <w:sz w:val="22"/>
+        <w:szCs w:val="22"/>
+        <w:lang w:val="pl-PL" w:eastAsia="pl-PL" w:bidi="ar-SA"/>
+      </w:rPr>
+    </w:rPrDefault>
+    <w:pPrDefault>
+      <w:pPr>
+        <w:spacing w:after="200" w:line="276" w:lineRule="auto"/>
+      </w:pPr>
+    </w:pPrDefault>
+  </w:docDefaults>
+  <w:latentStyles w:defLockedState="0" w:defUIPriority="99" w:defSemiHidden="1" w:defUnhideWhenUsed="1" w:defQFormat="0" w:count="267">
+    <w:lsdException w:name="Normal" w:semiHidden="0" w:uiPriority="0" w:unhideWhenUsed="0" w:qFormat="1"/>
+    <w:lsdException w:name="heading 1" w:semiHidden="0" w:uiPriority="9" w:unhideWhenUsed="0" w:qFormat="1"/>
+    <w:lsdException w:name="heading 2" w:uiPriority="9" w:qFormat="1"/>
+    <w:lsdException w:name="heading 3" w:uiPriority="9" w:qFormat="1"/>
+    <w:lsdException w:name="heading 4" w:uiPriority="9" w:qFormat="1"/>
+    <w:lsdException w:name="heading 5" w:uiPriority="9" w:qFormat="1"/>
+    <w:lsdException w:name="heading 6" w:uiPriority="9" w:qFormat="1"/>
+    <w:lsdException w:name="heading 7" w:uiPriority="9" w:qFormat="1"/>
+    <w:lsdException w:name="heading 8" w:uiPriority="9" w:qFormat="1"/>
+    <w:lsdException w:name="heading 9" w:uiPriority="9" w:qFormat="1"/>
+    <w:lsdException w:name="toc 1" w:uiPriority="39"/>
+    <w:lsdException w:name="toc 2" w:uiPriority="39"/>
+    <w:lsdException w:name="toc 3" w:uiPriority="39"/>
+    <w:lsdException w:name="toc 4" w:uiPriority="39"/>
+    <w:lsdException w:name="toc 5" w:uiPriority="39"/>
+    <w:lsdException w:name="toc 6" w:uiPriority="39"/>
+    <w:lsdException w:name="toc 7" w:uiPriority="39"/>
+    <w:lsdException w:name="toc 8" w:uiPriority="39"/>
+    <w:lsdException w:name="toc 9" w:uiPriority="39"/>
+    <w:lsdException w:name="caption" w:uiPriority="35" w:qFormat="1"/>
+    <w:lsdException w:name="Title" w:semiHidden="0" w:uiPriority="10" w:unhideWhenUsed="0" w:qFormat="1"/>
+    <w:lsdException w:name="Default Paragraph Font" w:uiPriority="1"/>
+    <w:lsdException w:name="Subtitle" w:semiHidden="0" w:uiPriority="11" w:unhideWhenUsed="0" w:qFormat="1"/>
+    <w:lsdException w:name="Strong" w:semiHidden="0" w:uiPriority="22" w:unhideWhenUsed="0" w:qFormat="1"/>
+    <w:lsdException w:name="Emphasis" w:semiHidden="0" w:uiPriority="20" w:unhideWhenUsed="0" w:qFormat="1"/>
+    <w:lsdException w:name="Table Grid" w:semiHidden="0" w:uiPriority="59" w:unhideWhenUsed="0"/>
+    <w:lsdException w:name="Placeholder Text" w:unhideWhenUsed="0"/>
+    <w:lsdException w:name="No Spacing" w:semiHidden="0" w:uiPriority="1" w:unhideWhenUsed="0" w:qFormat="1"/>
+    <w:lsdException w:name="Light Shading" w:semiHidden="0" w:uiPriority="60" w:unhideWhenUsed="0"/>
+    <w:lsdException w:name="Light List" w:semiHidden="0" w:uiPriority="61" w:unhideWhenUsed="0"/>
+    <w:lsdException w:name="Light Grid" w:semiHidden="0" w:uiPriority="62" w:unhideWhenUsed="0"/>
+    <w:lsdException w:name="Medium Shading 1" w:semiHidden="0" w:uiPriority="63" w:unhideWhenUsed="0"/>
+    <w:lsdException w:name="Medium Shading 2" w:semiHidden="0" w:uiPriority="64" w:unhideWhenUsed="0"/>
+    <w:lsdException w:name="Medium List 1" w:semiHidden="0" w:uiPriority="65" w:unhideWhenUsed="0"/>
+    <w:lsdException w:name="Medium List 2" w:semiHidden="0" w:uiPriority="66" w:unhideWhenUsed="0"/>
+    <w:lsdException w:name="Medium Grid 1" w:semiHidden="0" w:uiPriority="67" w:unhideWhenUsed="0"/>
+    <w:lsdException w:name="Medium Grid 2" w:semiHidden="0" w:uiPriority="68" w:unhideWhenUsed="0"/>
+    <w:lsdException w:name="Medium Grid 3" w:semiHidden="0" w:uiPriority="69" w:unhideWhenUsed="0"/>
+    <w:lsdException w:name="Dark List" w:semiHidden="0" w:uiPriority="70" w:unhideWhenUsed="0"/>
+    <w:lsdException w:name="Colorful Shading" w:semiHidden="0" w:uiPriority="71" w:unhideWhenUsed="0"/>
+    <w:lsdException w:name="Colorful List" w:semiHidden="0" w:uiPriority="72" w:unhideWhenUsed="0"/>
+    <w:lsdException w:name="Colorful Grid" w:semiHidden="0" w:uiPriority="73" w:unhideWhenUsed="0"/>
+    <w:lsdException w:name="Light Shading Accent 1" w:semiHidden="0" w:uiPriority="60" w:unhideWhenUsed="0"/>
+    <w:lsdException w:name="Light List Accent 1" w:semiHidden="0" w:uiPriority="61" w:unhideWhenUsed="0"/>
+    <w:lsdException w:name="Light Grid Accent 1" w:semiHidden="0" w:uiPriority="62" w:unhideWhenUsed="0"/>
+    <w:lsdException w:name="Medium Shading 1 Accent 1" w:semiHidden="0" w:uiPriority="63" w:unhideWhenUsed="0"/>
+    <w:lsdException w:name="Medium Shading 2 Accent 1" w:semiHidden="0" w:uiPriority="64" w:unhideWhenUsed="0"/>
+    <w:lsdException w:name="Medium List 1 Accent 1" w:semiHidden="0" w:uiPriority="65" w:unhideWhenUsed="0"/>
+    <w:lsdException w:name="Revision" w:unhideWhenUsed="0"/>
+    <w:lsdException w:name="List Paragraph" w:semiHidden="0" w:uiPriority="34" w:unhideWhenUsed="0" w:qFormat="1"/>
+    <w:lsdException w:name="Quote" w:semiHidden="0" w:uiPriority="29" w:unhideWhenUsed="0" w:qFormat="1"/>
+    <w:lsdException w:name="Intense Quote" w:semiHidden="0" w:uiPriority="30" w:unhideWhenUsed="0" w:qFormat="1"/>
+    <w:lsdException w:name="Medium List 2 Accent 1" w:semiHidden="0" w:uiPriority="66" w:unhideWhenUsed="0"/>
+    <w:lsdException w:name="Medium Grid 1 Accent 1" w:semiHidden="0" w:uiPriority="67" w:unhideWhenUsed="0"/>
+    <w:lsdException w:name="Medium Grid 2 Accent 1" w:semiHidden="0" w:uiPriority="68" w:unhideWhenUsed="0"/>
+    <w:lsdException w:name="Medium Grid 3 Accent 1" w:semiHidden="0" w:uiPriority="69" w:unhideWhenUsed="0"/>
+    <w:lsdException w:name="Dark List Accent 1" w:semiHidden="0" w:uiPriority="70" w:unhideWhenUsed="0"/>
+    <w:lsdException w:name="Colorful Shading Accent 1" w:semiHidden="0" w:uiPriority="71" w:unhideWhenUsed="0"/>
+    <w:lsdException w:name="Colorful List Accent 1" w:semiHidden="0" w:uiPriority="72" w:unhideWhenUsed="0"/>
+    <w:lsdException w:name="Colorful Grid Accent 1" w:semiHidden="0" w:uiPriority="73" w:unhideWhenUsed="0"/>
+    <w:lsdException w:name="Light Shading Accent 2" w:semiHidden="0" w:uiPriority="60" w:unhideWhenUsed="0"/>
+    <w:lsdException w:name="Light List Accent 2" w:semiHidden="0" w:uiPriority="61" w:unhideWhenUsed="0"/>
+    <w:lsdException w:name="Light Grid Accent 2" w:semiHidden="0" w:uiPriority="62" w:unhideWhenUsed="0"/>
+    <w:lsdException w:name="Medium Shading 1 Accent 2" w:semiHidden="0" w:uiPriority="63" w:unhideWhenUsed="0"/>
+    <w:lsdException w:name="Medium Shading 2 Accent 2" w:semiHidden="0" w:uiPriority="64" w:unhideWhenUsed="0"/>
+    <w:lsdException w:name="Medium List 1 Accent 2" w:semiHidden="0" w:uiPriority="65" w:unhideWhenUsed="0"/>
+    <w:lsdException w:name="Medium List 2 Accent 2" w:semiHidden="0" w:uiPriority="66" w:unhideWhenUsed="0"/>
+    <w:lsdException w:name="Medium Grid 1 Accent 2" w:semiHidden="0" w:uiPriority="67" w:unhideWhenUsed="0"/>
+    <w:lsdException w:name="Medium Grid 2 Accent 2" w:semiHidden="0" w:uiPriority="68" w:unhideWhenUsed="0"/>
+    <w:lsdException w:name="Medium Grid 3 Accent 2" w:semiHidden="0" w:uiPriority="69" w:unhideWhenUsed="0"/>
+    <w:lsdException w:name="Dark List Accent 2" w:semiHidden="0" w:uiPriority="70" w:unhideWhenUsed="0"/>
+    <w:lsdException w:name="Colorful Shading Accent 2" w:semiHidden="0" w:uiPriority="71" w:unhideWhenUsed="0"/>
+    <w:lsdException w:name="Colorful List Accent 2" w:semiHidden="0" w:uiPriority="72" w:unhideWhenUsed="0"/>
+    <w:lsdException w:name="Colorful Grid Accent 2" w:semiHidden="0" w:uiPriority="73" w:unhideWhenUsed="0"/>
+    <w:lsdException w:name="Light Shading Accent 3" w:semiHidden="0" w:uiPriority="60" w:unhideWhenUsed="0"/>
+    <w:lsdException w:name="Light List Accent 3" w:semiHidden="0" w:uiPriority="61" w:unhideWhenUsed="0"/>
+    <w:lsdException w:name="Light Grid Accent 3" w:semiHidden="0" w:uiPriority="62" w:unhideWhenUsed="0"/>
+    <w:lsdException w:name="Medium Shading 1 Accent 3" w:semiHidden="0" w:uiPriority="63" w:unhideWhenUsed="0"/>
+    <w:lsdException w:name="Medium Shading 2 Accent 3" w:semiHidden="0" w:uiPriority="64" w:unhideWhenUsed="0"/>
+    <w:lsdException w:name="Medium List 1 Accent 3" w:semiHidden="0" w:uiPriority="65" w:unhideWhenUsed="0"/>
+    <w:lsdException w:name="Medium List 2 Accent 3" w:semiHidden="0" w:uiPriority="66" w:unhideWhenUsed="0"/>
+    <w:lsdException w:name="Medium Grid 1 Accent 3" w:semiHidden="0" w:uiPriority="67" w:unhideWhenUsed="0"/>
+    <w:lsdException w:name="Medium Grid 2 Accent 3" w:semiHidden="0" w:uiPriority="68" w:unhideWhenUsed="0"/>
+    <w:lsdException w:name="Medium Grid 3 Accent 3" w:semiHidden="0" w:uiPriority="69" w:unhideWhenUsed="0"/>
+    <w:lsdException w:name="Dark List Accent 3" w:semiHidden="0" w:uiPriority="70" w:unhideWhenUsed="0"/>
+    <w:lsdException w:name="Colorful Shading Accent 3" w:semiHidden="0" w:uiPriority="71" w:unhideWhenUsed="0"/>
+    <w:lsdException w:name="Colorful List Accent 3" w:semiHidden="0" w:uiPriority="72" w:unhideWhenUsed="0"/>
+    <w:lsdException w:name="Colorful Grid Accent 3" w:semiHidden="0" w:uiPriority="73" w:unhideWhenUsed="0"/>
+    <w:lsdException w:name="Light Shading Accent 4" w:semiHidden="0" w:uiPriority="60" w:unhideWhenUsed="0"/>
+    <w:lsdException w:name="Light List Accent 4" w:semiHidden="0" w:uiPriority="61" w:unhideWhenUsed="0"/>
+    <w:lsdException w:name="Light Grid Accent 4" w:semiHidden="0" w:uiPriority="62" w:unhideWhenUsed="0"/>
+    <w:lsdException w:name="Medium Shading 1 Accent 4" w:semiHidden="0" w:uiPriority="63" w:unhideWhenUsed="0"/>
+    <w:lsdException w:name="Medium Shading 2 Accent 4" w:semiHidden="0" w:uiPriority="64" w:unhideWhenUsed="0"/>
+    <w:lsdException w:name="Medium List 1 Accent 4" w:semiHidden="0" w:uiPriority="65" w:unhideWhenUsed="0"/>
+    <w:lsdException w:name="Medium List 2 Accent 4" w:semiHidden="0" w:uiPriority="66" w:unhideWhenUsed="0"/>
+    <w:lsdException w:name="Medium Grid 1 Accent 4" w:semiHidden="0" w:uiPriority="67" w:unhideWhenUsed="0"/>
+    <w:lsdException w:name="Medium Grid 2 Accent 4" w:semiHidden="0" w:uiPriority="68" w:unhideWhenUsed="0"/>
+    <w:lsdException w:name="Medium Grid 3 Accent 4" w:semiHidden="0" w:uiPriority="69" w:unhideWhenUsed="0"/>
+    <w:lsdException w:name="Dark List Accent 4" w:semiHidden="0" w:uiPriority="70" w:unhideWhenUsed="0"/>
+    <w:lsdException w:name="Colorful Shading Accent 4" w:semiHidden="0" w:uiPriority="71" w:unhideWhenUsed="0"/>
+    <w:lsdException w:name="Colorful List Accent 4" w:semiHidden="0" w:uiPriority="72" w:unhideWhenUsed="0"/>
+    <w:lsdException w:name="Colorful Grid Accent 4" w:semiHidden="0" w:uiPriority="73" w:unhideWhenUsed="0"/>
+    <w:lsdException w:name="Light Shading Accent 5" w:semiHidden="0" w:uiPriority="60" w:unhideWhenUsed="0"/>
+    <w:lsdException w:name="Light List Accent 5" w:semiHidden="0" w:uiPriority="61" w:unhideWhenUsed="0"/>
+    <w:lsdException w:name="Light Grid Accent 5" w:semiHidden="0" w:uiPriority="62" w:unhideWhenUsed="0"/>
+    <w:lsdException w:name="Medium Shading 1 Accent 5" w:semiHidden="0" w:uiPriority="63" w:unhideWhenUsed="0"/>
+    <w:lsdException w:name="Medium Shading 2 Accent 5" w:semiHidden="0" w:uiPriority="64" w:unhideWhenUsed="0"/>
+    <w:lsdException w:name="Medium List 1 Accent 5" w:semiHidden="0" w:uiPriority="65" w:unhideWhenUsed="0"/>
+    <w:lsdException w:name="Medium List 2 Accent 5" w:semiHidden="0" w:uiPriority="66" w:unhideWhenUsed="0"/>
+    <w:lsdException w:name="Medium Grid 1 Accent 5" w:semiHidden="0" w:uiPriority="67" w:unhideWhenUsed="0"/>
+    <w:lsdException w:name="Medium Grid 2 Accent 5" w:semiHidden="0" w:uiPriority="68" w:unhideWhenUsed="0"/>
+    <w:lsdException w:name="Medium Grid 3 Accent 5" w:semiHidden="0" w:uiPriority="69" w:unhideWhenUsed="0"/>
+    <w:lsdException w:name="Dark List Accent 5" w:semiHidden="0" w:uiPriority="70" w:unhideWhenUsed="0"/>
+    <w:lsdException w:name="Colorful Shading Accent 5" w:semiHidden="0" w:uiPriority="71" w:unhideWhenUsed="0"/>
+    <w:lsdException w:name="Colorful List Accent 5" w:semiHidden="0" w:uiPriority="72" w:unhideWhenUsed="0"/>
+    <w:lsdException w:name="Colorful Grid Accent 5" w:semiHidden="0" w:uiPriority="73" w:unhideWhenUsed="0"/>
+    <w:lsdException w:name="Light Shading Accent 6" w:semiHidden="0" w:uiPriority="60" w:unhideWhenUsed="0"/>
+    <w:lsdException w:name="Light List Accent 6" w:semiHidden="0" w:uiPriority="61" w:unhideWhenUsed="0"/>
+    <w:lsdException w:name="Light Grid Accent 6" w:semiHidden="0" w:uiPriority="62" w:unhideWhenUsed="0"/>
+    <w:lsdException w:name="Medium Shading 1 Accent 6" w:semiHidden="0" w:uiPriority="63" w:unhideWhenUsed="0"/>
+    <w:lsdException w:name="Medium Shading 2 Accent 6" w:semiHidden="0" w:uiPriority="64" w:unhideWhenUsed="0"/>
+    <w:lsdException w:name="Medium List 1 Accent 6" w:semiHidden="0" w:uiPriority="65" w:unhideWhenUsed="0"/>
+    <w:lsdException w:name="Medium List 2 Accent 6" w:semiHidden="0" w:uiPriority="66" w:unhideWhenUsed="0"/>
+    <w:lsdException w:name="Medium Grid 1 Accent 6" w:semiHidden="0" w:uiPriority="67" w:unhideWhenUsed="0"/>
+    <w:lsdException w:name="Medium Grid 2 Accent 6" w:semiHidden="0" w:uiPriority="68" w:unhideWhenUsed="0"/>
+    <w:lsdException w:name="Medium Grid 3 Accent 6" w:semiHidden="0" w:uiPriority="69" w:unhideWhenUsed="0"/>
+    <w:lsdException w:name="Dark List Accent 6" w:semiHidden="0" w:uiPriority="70" w:unhideWhenUsed="0"/>
+    <w:lsdException w:name="Colorful Shading Accent 6" w:semiHidden="0" w:uiPriority="71" w:unhideWhenUsed="0"/>
+    <w:lsdException w:name="Colorful List Accent 6" w:semiHidden="0" w:uiPriority="72" w:unhideWhenUsed="0"/>
+    <w:lsdException w:name="Colorful Grid Accent 6" w:semiHidden="0" w:uiPriority="73" w:unhideWhenUsed="0"/>
+    <w:lsdException w:name="Subtle Emphasis" w:semiHidden="0" w:uiPriority="19" w:unhideWhenUsed="0" w:qFormat="1"/>
+    <w:lsdException w:name="Intense Emphasis" w:semiHidden="0" w:uiPriority="21" w:unhideWhenUsed="0" w:qFormat="1"/>
+    <w:lsdException w:name="Subtle Reference" w:semiHidden="0" w:uiPriority="31" w:unhideWhenUsed="0" w:qFormat="1"/>
+    <w:lsdException w:name="Intense Reference" w:semiHidden="0" w:uiPriority="32" w:unhideWhenUsed="0" w:qFormat="1"/>
+    <w:lsdException w:name="Book Title" w:semiHidden="0" w:uiPriority="33" w:unhideWhenUsed="0" w:qFormat="1"/>
+    <w:lsdException w:name="Bibliography" w:uiPriority="37"/>
+    <w:lsdException w:name="TOC Heading" w:uiPriority="39" w:qFormat="1"/>
+  </w:latentStyles>
+  <w:style w:type="paragraph" w:default="1" w:styleId="Normalny">
+    <w:name w:val="Normal"/>
     <w:qFormat/>
+  </w:style>
+  <w:style w:type="character" w:default="1" w:styleId="Domylnaczcionkaakapitu">
+    <w:name w:val="Default Paragraph Font"/>
+    <w:uiPriority w:val="1"/>
+    <w:semiHidden/>
+    <w:unhideWhenUsed/>
+  </w:style>
+  <w:style w:type="table" w:default="1" w:styleId="Standardowy">
+    <w:name w:val="Normal Table"/>
+    <w:uiPriority w:val="99"/>
+    <w:semiHidden/>
+    <w:unhideWhenUsed/>
     <w:tblPr>
       <w:tblInd w:w="0" w:type="dxa"/>
       <w:tblCellMar>

</xml_diff>